<commit_message>
docs: update verifikasi_relasi screenshot and regenerate docx and pdf reports
</commit_message>
<xml_diff>
--- a/basis_data/tugas 2/reports/Laporan_Tugas_2_MSIM4206_Basis_Data.docx
+++ b/basis_data/tugas 2/reports/Laporan_Tugas_2_MSIM4206_Basis_Data.docx
@@ -6115,7 +6115,7 @@
       <w:r>
         <w:drawing>
           <wp:inline xmlns:a="http://schemas.openxmlformats.org/drawingml/2006/main" xmlns:pic="http://schemas.openxmlformats.org/drawingml/2006/picture">
-            <wp:extent cx="5852160" cy="699516"/>
+            <wp:extent cx="5852160" cy="1183327"/>
             <wp:docPr id="19" name="Picture 19"/>
             <wp:cNvGraphicFramePr>
               <a:graphicFrameLocks noChangeAspect="1"/>
@@ -6136,7 +6136,7 @@
                   <pic:spPr>
                     <a:xfrm>
                       <a:off x="0" y="0"/>
-                      <a:ext cx="5852160" cy="699516"/>
+                      <a:ext cx="5852160" cy="1183327"/>
                     </a:xfrm>
                     <a:prstGeom prst="rect"/>
                   </pic:spPr>

</xml_diff>